<commit_message>
fix(defense-lab): calibrate KYC image feature extraction and add forensic benchmark presets
</commit_message>
<xml_diff>
--- a/FraudForge-Approach.docx
+++ b/FraudForge-Approach.docx
@@ -137,7 +137,7 @@
           <w:color w:val="141820"/>
           <w:sz w:val="21"/>
         </w:rPr>
-        <w:t>The Red Team plans and sequences attacks against synthetic accounts. The Blue Team scores every resulting payment twice — once with flat threshold rules, once against that account’s own behavioural baseline — and the difference between them is the measurement. The loop is:</w:t>
+        <w:t>The Red Team plans and sequences attacks against synthetic accounts. The Blue Team scores every resulting payment twice: once with flat threshold rules, once against that account’s own behavioural baseline. The difference between them is the measurement. The loop is:</w:t>
       </w:r>
     </w:p>
     <w:p>
@@ -1289,7 +1289,7 @@
           <w:color w:val="141820"/>
           <w:sz w:val="25"/>
         </w:rPr>
-        <w:t>3.1  Adversarial Probing — learning the detector’s boundary</w:t>
+        <w:t>3.1  Adversarial Probing: learning the detector’s boundary</w:t>
       </w:r>
     </w:p>
     <w:p>
@@ -1328,7 +1328,7 @@
           <w:color w:val="141820"/>
           <w:sz w:val="21"/>
         </w:rPr>
-        <w:t>In an adversarial probing attack the attacker makes a series of controlled variations — amount, timing, frequency, device, behavioural context — and observes which trip the defence. The objective is not evasion by luck. It is to map the decision boundary, then construct a later attack that sits inside the safe region.</w:t>
+        <w:t>In an adversarial probing attack the attacker makes a series of controlled variations (amount, timing, frequency, device, behavioural context) and observes which ones trip the defence. The objective is not evasion by luck. It is to map the decision boundary, then construct a later attack that sits inside the safe region.</w:t>
       </w:r>
     </w:p>
     <w:tbl>
@@ -1790,7 +1790,7 @@
           <w:color w:val="141820"/>
           <w:sz w:val="21"/>
         </w:rPr>
-        <w:t xml:space="preserve"> against a legacy baseline of 2.8%. The account-relative scorer, which beats flat rules almost everywhere else, gains almost nothing here — because the attack is built to suppress exactly the features it relies on. That is the clearest possible demonstration that probing works, and a system reporting only its aggregate would never have surfaced it.</w:t>
+        <w:t xml:space="preserve"> against a legacy baseline of 2.8%. The account-relative scorer, which beats flat rules almost everywhere else, gains almost nothing here, because the attack is built to suppress exactly the features it relies on. That is the clearest possible demonstration that probing works, and a system reporting only its aggregate would never have surfaced it.</w:t>
       </w:r>
     </w:p>
     <w:p>
@@ -1804,7 +1804,7 @@
           <w:color w:val="141820"/>
           <w:sz w:val="25"/>
         </w:rPr>
-        <w:t>3.2  Sleeper Transaction Pacing — attacking the time horizon</w:t>
+        <w:t>3.2  Sleeper Transaction Pacing: attacking the time horizon</w:t>
       </w:r>
     </w:p>
     <w:p>
@@ -1873,7 +1873,7 @@
           <w:color w:val="141820"/>
           <w:sz w:val="21"/>
         </w:rPr>
-        <w:t xml:space="preserve"> — eighteen payments that start at 55% of the account’s normal amount and drift up to 95%, deliberately never crossing it, while velocity climbs from 3 to 5 an hour. No fixed amount ceiling is ever touched, which is the entire point.</w:t>
+        <w:t>. That is eighteen payments starting at 55% of the account’s normal amount and drifting up to 95%, deliberately never crossing it, while velocity climbs from 3 to 5 an hour. No fixed amount ceiling is ever touched, which is the entire point.</w:t>
       </w:r>
     </w:p>
     <w:tbl>
@@ -2590,7 +2590,7 @@
                 <w:color w:val="141820"/>
                 <w:sz w:val="17"/>
               </w:rPr>
-              <w:t>Every payment scored twice — flat rules and account-relative — with per-signal reasons attached.</w:t>
+              <w:t>Every payment scored twice, by flat rules and by account-relative scoring, with per-signal reasons attached.</w:t>
             </w:r>
           </w:p>
         </w:tc>
@@ -2914,7 +2914,7 @@
           <w:color w:val="141820"/>
           <w:sz w:val="21"/>
         </w:rPr>
-        <w:t xml:space="preserve"> is not in requirements, so the deployed build runs the deterministic planner throughout — which is also why every figure in this document is exactly reproducible from a seed. The LLM path is architecture, not a claim about what produced these numbers.</w:t>
+        <w:t xml:space="preserve"> is not in requirements, so the deployed build runs the deterministic planner throughout. That is also why every figure in this document is exactly reproducible from a seed. The LLM path is architecture, not a claim about what produced these numbers.</w:t>
       </w:r>
     </w:p>
     <w:p>
@@ -4011,7 +4011,7 @@
           <w:color w:val="555D6B"/>
           <w:sz w:val="17"/>
         </w:rPr>
-        <w:t>Only timings and counts are captured. The characters typed are never stored — the panel in the Defense Lab enrols and scores entirely in the browser.</w:t>
+        <w:t>Only timings and counts are captured. The characters typed are never stored, the panel in the Defense Lab enrols and scores entirely in the browser.</w:t>
       </w:r>
     </w:p>
     <w:p>
@@ -5707,7 +5707,7 @@
           <w:color w:val="141820"/>
           <w:sz w:val="25"/>
         </w:rPr>
-        <w:t>7.4  Efficacy by attack vector — where the blind spots are</w:t>
+        <w:t>7.4  Efficacy by attack vector: where the blind spots are</w:t>
       </w:r>
     </w:p>
     <w:p>
@@ -5721,7 +5721,7 @@
           <w:color w:val="141820"/>
           <w:sz w:val="21"/>
         </w:rPr>
-        <w:t xml:space="preserve">Every vector run against all 10 accounts at three seeds — </w:t>
+        <w:t xml:space="preserve">Every vector run against all 10 accounts at three seeds, for a total of </w:t>
       </w:r>
       <w:r>
         <w:rPr>
@@ -8745,7 +8745,7 @@
           <w:color w:val="555D6B"/>
           <w:sz w:val="17"/>
         </w:rPr>
-        <w:t>Colour encodes performance, not which detector: under 34% red, 34–67% amber, above 67% green — applied identically to both columns.</w:t>
+        <w:t>Colour encodes performance, not which detector: under 34% red, 34–67% amber, above 67% green, applied identically to both columns.</w:t>
       </w:r>
     </w:p>
     <w:p>
@@ -8795,7 +8795,7 @@
           <w:color w:val="141820"/>
           <w:sz w:val="21"/>
         </w:rPr>
-        <w:t xml:space="preserve">The benchmark scores 300 legitimate payments. One false positive in 300 reads as 0.33% — but the 95% Wilson interval runs 0.06% to 1.86%, a thirty-fold range. It cannot resolve the quantity it reports. Measured on </w:t>
+        <w:t xml:space="preserve">The benchmark scores 300 legitimate payments. One false positive in 300 reads as 0.33%, but the 95% Wilson interval runs 0.06% to 1.86%, a thirty-fold range. It cannot resolve the quantity it reports. Measured on </w:t>
       </w:r>
       <w:r>
         <w:rPr>
@@ -8813,7 +8813,7 @@
           <w:color w:val="141820"/>
           <w:sz w:val="21"/>
         </w:rPr>
-        <w:t xml:space="preserve"> with a 95% interval of 0.667% to 0.741% — roughly double, and narrow enough to plan against.</w:t>
+        <w:t>, with a 95% interval of 0.667% to 0.741%. Roughly double, and narrow enough to plan against.</w:t>
       </w:r>
     </w:p>
     <w:p>
@@ -8842,7 +8842,7 @@
           <w:color w:val="141820"/>
           <w:sz w:val="21"/>
         </w:rPr>
-        <w:t>10,018 alerts per million, of which 3,023 are fraud — precision 30.2%</w:t>
+        <w:t>10,018 alerts per million, of which 3,023 are fraud, a precision of 30.2%</w:t>
       </w:r>
       <w:r>
         <w:rPr>
@@ -11104,7 +11104,7 @@
           <w:color w:val="555D6B"/>
           <w:sz w:val="17"/>
         </w:rPr>
-        <w:t>Of the 220 LightGBM vectors, 36 carry missing values and 9 carry a category the model never saw — the two routing paths that fail silently when a port gets them wrong.</w:t>
+        <w:t>Of the 220 LightGBM vectors, 36 carry missing values and 9 carry a category the model never saw. Those are the two routing paths that fail silently when a port gets them wrong.</w:t>
       </w:r>
     </w:p>
     <w:p>
@@ -11158,7 +11158,7 @@
           <w:color w:val="141820"/>
           <w:sz w:val="21"/>
         </w:rPr>
-        <w:t>Its config records a count (86) and no names; the booster’s names are Column_0..Column_85 and there is no feature_names_in_ on the estimator — all three are what you get from fitting on a bare array. There is no extractor to rebuild, so there is no video upload. The ensemble is real and responsive, so the panel drives its 86-dimensional vector directly instead. Nothing claims to know what Column_14 measures.</w:t>
+        <w:t>Its config records a count (86) and no names; the booster’s names are Column_0..Column_85 and there is no feature_names_in_ on the estimator. All three are what you get from fitting on a bare array. There is no extractor to rebuild, so there is no video upload. The ensemble is real and responsive, so the panel drives its 86-dimensional vector directly instead. Nothing claims to know what Column_14 measures.</w:t>
       </w:r>
     </w:p>
     <w:p>
@@ -13343,7 +13343,7 @@
           <w:color w:val="141820"/>
           <w:sz w:val="21"/>
         </w:rPr>
-        <w:t>Adversarial Probing tests whether an attacker can learn the decision boundary; Sleeper Pacing tests whether it can exploit a limited time horizon. Both are implemented, and both are measurably the hardest vectors in the system to catch — targeted feature suppression at 3.1% against 100.0% for a loud attack, a 33-fold spread the aggregate would have hidden.</w:t>
+        <w:t>Adversarial Probing tests whether an attacker can learn the decision boundary; Sleeper Pacing tests whether it can exploit a limited time horizon. Both are implemented, and both are measurably the hardest vectors in the system to catch: targeted feature suppression at 3.1% against 100.0% for a loud attack, a 33-fold spread the aggregate would have hidden.</w:t>
       </w:r>
     </w:p>
     <w:p>
@@ -13440,7 +13440,7 @@
           <w:color w:val="141820"/>
           <w:sz w:val="21"/>
         </w:rPr>
-        <w:t>FraudForge does not ask whether a fraud detector works. It asks how an attacker can make it fail — and gives the defender a way to find and fix that failure before the real world does.</w:t>
+        <w:t>FraudForge does not ask whether a fraud detector works. It asks how an attacker can make it fail, and gives the defender a way to find and fix that failure before the real world does.</w:t>
       </w:r>
     </w:p>
     <w:sectPr>

</xml_diff>